<commit_message>
Drop ROUGE-SEM/MCRSpell citation sentence and decision note
Co-Authored-By: Claude Sonnet 5.5 <noreply@anthropic.com>
Claude-Session: https://claude.ai/code/session_015MZUD1uckkcV1CURRKFrEf
</commit_message>
<xml_diff>
--- a/teff/manuscript/manuscript_revised_clean.docx
+++ b/teff/manuscript/manuscript_revised_clean.docx
@@ -558,7 +558,7 @@
       </w:r>
       <w:r>
         <w:rPr/>
-        <w:t xml:space="preserve"> Estimating semantic equivalence reliably is itself a representation problem. Entailment-based clustering relies on a natural-language-inference model [20,21], whereas evaluation metrics that combine lexical overlap with semantic similarity, such as ROUGE-SEM [22], and representation-learning approaches to correcting surface errors, such as MCRSpell [23], illustrate how much the outcome depends on the quality of the learned representation. We use an entailment model only for the free-generation semantic-entropy baseline (Section 5.12) and do not evaluate its reliability.</w:t>
+        <w:t xml:space="preserve"> Estimating semantic equivalence reliably is itself a representation problem. Entailment-based clustering relies on a natural-language-inference model [20,21], and its outcome depends on how well that model represents the text being compared. We use an entailment model only for the free-generation semantic-entropy baseline (Section 5.12) and do not evaluate its reliability.</w:t>
       </w:r>
     </w:p>
     <w:p>
@@ -600,7 +600,7 @@
       </w:r>
       <w:r>
         <w:rPr/>
-        <w:t xml:space="preserve"> The estimator in Section 3.2 is a quasi-likelihood in the sense of White [19]: when the reference family is misspecified, the maximizer converges to the member of the family closest in Kullback-Leibler divergence to the true choice distribution, and the log likelihood is a strictly proper scoring rule [24].</w:t>
+        <w:t xml:space="preserve"> The estimator in Section 3.2 is a quasi-likelihood in the sense of White [19]: when the reference family is misspecified, the maximizer converges to the member of the family closest in Kullback-Leibler divergence to the true choice distribution, and the log likelihood is a strictly proper scoring rule [22].</w:t>
       </w:r>
     </w:p>
     <w:p>
@@ -26616,84 +26616,6 @@
       <w:r>
         <w:rPr/>
         <w:t>Williams, A.; Nangia, N.; Bowman, S. A Broad-Coverage Challenge Corpus for Sentence Understanding through Inference. In Proceedings of NAACL-HLT 2018, New Orleans, LA, USA, 1–6 June 2018; pp. 1112–1122.</w:t>
-      </w:r>
-    </w:p>
-    <w:p>
-      <w:pPr>
-        <w:pStyle w:val="MDPI81references"/>
-        <w:numPr>
-          <w:ilvl w:val="0"/>
-          <w:numId w:val="8"/>
-        </w:numPr>
-        <w:ind w:left="425" w:hanging="425"/>
-      </w:pPr>
-      <w:r>
-        <w:rPr/>
-        <w:t xml:space="preserve">Zhang, M.; Li, C.; Wan, M.; et al. ROUGE-SEM: Better Evaluation of Summarization Using ROUGE Combined with Semantics. </w:t>
-      </w:r>
-      <w:r>
-        <w:rPr>
-          <w:i/>
-        </w:rPr>
-        <w:t>Expert Syst. Appl.</w:t>
-      </w:r>
-      <w:r>
-        <w:rPr/>
-        <w:t xml:space="preserve"> </w:t>
-      </w:r>
-      <w:r>
-        <w:rPr>
-          <w:b/>
-        </w:rPr>
-        <w:t>2023</w:t>
-      </w:r>
-      <w:r>
-        <w:rPr/>
-        <w:t>, 121364.</w:t>
-      </w:r>
-    </w:p>
-    <w:p>
-      <w:pPr>
-        <w:pStyle w:val="MDPI81references"/>
-        <w:numPr>
-          <w:ilvl w:val="0"/>
-          <w:numId w:val="8"/>
-        </w:numPr>
-        <w:ind w:left="425" w:hanging="425"/>
-      </w:pPr>
-      <w:r>
-        <w:rPr/>
-        <w:t xml:space="preserve">Li, C.; Zhang, M.; Zhang, X.; Yan, Y. MCRSpell: A Metric Learning of Correct Representation for Chinese Spelling Correction. </w:t>
-      </w:r>
-      <w:r>
-        <w:rPr>
-          <w:i/>
-        </w:rPr>
-        <w:t>Expert Syst. Appl.</w:t>
-      </w:r>
-      <w:r>
-        <w:rPr/>
-        <w:t xml:space="preserve"> </w:t>
-      </w:r>
-      <w:r>
-        <w:rPr>
-          <w:b/>
-        </w:rPr>
-        <w:t>2024</w:t>
-      </w:r>
-      <w:r>
-        <w:rPr/>
-        <w:t xml:space="preserve">, </w:t>
-      </w:r>
-      <w:r>
-        <w:rPr>
-          <w:i/>
-        </w:rPr>
-        <w:t>237</w:t>
-      </w:r>
-      <w:r>
-        <w:rPr/>
-        <w:t>, 121513.</w:t>
       </w:r>
     </w:p>
     <w:p>

</xml_diff>

<commit_message>
Address second reviewer: fit/failure analysis, qualified Section 3.2, three citations
Co-Authored-By: Claude Sonnet 5.5 <noreply@anthropic.com>
Claude-Session: https://claude.ai/code/session_015MZUD1uckkcV1CURRKFrEf
</commit_message>
<xml_diff>
--- a/teff/manuscript/manuscript_revised_clean.docx
+++ b/teff/manuscript/manuscript_revised_clean.docx
@@ -329,7 +329,15 @@
       </w:pPr>
       <w:r>
         <w:rPr/>
-        <w:t xml:space="preserve">That assumption is fragile for autoregressive agents. The same weights can solve a task when the context is clean and fail on it when the context contains contradictory instructions, hostile framing or an earlier mistake. The failure is often not random noise. A well-documented form is rigid repetition, in which the model locks onto a continuation and reproduces it with high confidence [1]. In an agentic loop the problem is compounded, because each output is written back into the context and conditions the next step. A single early error can therefore turn into a self-reinforcing trajectory. The temperature the operator set is a property of the decoder. It says nothing about what the context has done to the model's preferences, so two agents run at the same temperature can be in very different decision states.</w:t>
+        <w:t xml:space="preserve">That assumption is fragile for autoregressive agents. The same weights can solve a task when the context is clean and fail on it when the context contains contradictory instructions, hostile framing or an earlier mistake. The failure is often not random noise. A well-documented form is rigid repetition, in which the model locks onto a continuation and reproduces it </w:t>
+      </w:r>
+      <w:r>
+        <w:rPr/>
+        <w:t>with high confidence [1,24]</w:t>
+      </w:r>
+      <w:r>
+        <w:rPr/>
+        <w:t xml:space="preserve">. In an agentic loop the problem is compounded, because each output is written back into the context and conditions the next step. A single early error can therefore turn into a self-reinforcing trajectory. The temperature the operator set is a property of the decoder. It says nothing about what the context has done to the model's preferences, so two agents run at the same temperature can be in very different decision states.</w:t>
       </w:r>
     </w:p>
     <w:p>
@@ -377,7 +385,10 @@
       </w:r>
       <w:r>
         <w:rPr/>
-        <w:t xml:space="preserve"> departs from it, in either direction.</w:t>
+      </w:r>
+      <w:r>
+        <w:rPr/>
+        <w:t xml:space="preserve"> may depart from it, in either direction, although it need not (Section 3.3).</w:t>
       </w:r>
     </w:p>
     <w:p>
@@ -537,6 +548,10 @@
         <w:rPr/>
         <w:t xml:space="preserve">The softmax with a temperature parameter is a standard component of neural sequence models and of knowledge distillation [9]. In language generation, low temperatures and greedy decoding tend to produce repetitive text, whereas high temperatures produce incoherent text, and truncation schemes such as nucleus sampling were introduced to navigate this trade-off [1]. Studies of temperature typically treat it as a free hyperparameter to be tuned on a benchmark. We take a different view. The temperature that matters for reliability is the one that is operative in the model's choices, which may differ from the one the operator set.</w:t>
       </w:r>
+      <w:r>
+        <w:rPr/>
+        <w:t xml:space="preserve"> Empirical work that varies the temperature on problem-solving benchmarks finds that changes between 0 and 1 have little systematic effect on average accuracy [23]. That is a statement about performance averaged over contexts, whereas the question here is how the effect of one temperature changes with the context. Repetition loops, in which the probability of a repeated continuation grows with each repetition, have been analysed and mitigated at training time [24]; our planted attractor is a controlled version of that self-reinforcement.</w:t>
+      </w:r>
     </w:p>
     <w:p>
       <w:pPr>
@@ -555,6 +570,24 @@
       <w:r>
         <w:rPr/>
         <w:t xml:space="preserve">Work on uncertainty in language models asks whether the model's expressed or implied confidence tracks its correctness. Larger models are partly able to judge whether they know the answer to a question [3], and modern neural networks are often miscalibrated, a property commonly summarized by the expected calibration error [2]. Because a single answer can be phrased in many ways, token-level entropy conflates lexical and semantic uncertainty. Semantic entropy addresses this by sampling several answers, grouping those that mean the same thing and computing the entropy over the groups [4,5]. These methods are designed to detect that an answer is unreliable. They are not designed to detect that the decision state of the agent has been altered by its context, and the label-free ones among them cannot distinguish a concentrated distribution that is correct from one that is not.</w:t>
+      </w:r>
+      <w:r>
+        <w:rPr/>
+        <w:t xml:space="preserve"> Adaptive temperature scaling fits a per-token temperature to calibrate the probabilities of a fine-tuned model [25]. Its temperature is a calibration device fitted on labelled data, whereas </w:t>
+      </w:r>
+      <w:r>
+        <w:rPr>
+          <w:i/>
+        </w:rPr>
+        <w:t>T</w:t>
+      </w:r>
+      <w:r>
+        <w:rPr/>
+        <w:t>eff</w:t>
+      </w:r>
+      <w:r>
+        <w:rPr/>
+        <w:t xml:space="preserve"> is fitted against a clean-context reference without labels; both treat the effective temperature as depending on the context.</w:t>
       </w:r>
       <w:r>
         <w:rPr/>
@@ -1175,7 +1208,11 @@
       </w:r>
       <w:r>
         <w:rPr/>
-        <w:t xml:space="preserve"> estimates the nominal temperature. If the context alters the valuations, the chosen tokens are explained less well by the reference, and T</w:t>
+        <w:t xml:space="preserve"> estimates the nominal temperature. If the context alters the valuations, </w:t>
+      </w:r>
+      <w:r>
+        <w:rPr/>
+        <w:t>the chosen tokens are in general explained less well by the reference, and T</w:t>
       </w:r>
       <w:r>
         <w:rPr>
@@ -1185,7 +1222,10 @@
       </w:r>
       <w:r>
         <w:rPr/>
-        <w:t xml:space="preserve"> departs from </w:t>
+      </w:r>
+      <w:r>
+        <w:rPr/>
+        <w:t xml:space="preserve"> may depart from </w:t>
       </w:r>
       <w:r>
         <w:rPr>
@@ -1195,7 +1235,34 @@
       </w:r>
       <w:r>
         <w:rPr/>
-        <w:t xml:space="preserve">. A value above </w:t>
+      </w:r>
+      <w:r>
+        <w:rPr/>
+        <w:t xml:space="preserve">. It need not: a change that leaves the scale and the ordering of the candidates unchanged, or whose effects cancel across steps, leaves </w:t>
+      </w:r>
+      <w:r>
+        <w:rPr>
+          <w:i/>
+        </w:rPr>
+        <w:t>T</w:t>
+      </w:r>
+      <w:r>
+        <w:rPr/>
+        <w:t>eff</w:t>
+      </w:r>
+      <w:r>
+        <w:rPr/>
+        <w:t xml:space="preserve"> at </w:t>
+      </w:r>
+      <w:r>
+        <w:rPr>
+          <w:i/>
+        </w:rPr>
+        <w:t>T</w:t>
+      </w:r>
+      <w:r>
+        <w:rPr/>
+        <w:t xml:space="preserve">, and a change of ordering alone corresponds to no particular temperature (Section 3.3). A value above </w:t>
       </w:r>
       <w:r>
         <w:rPr>
@@ -20406,6 +20473,1924 @@
     </w:tbl>
     <w:p>
       <w:pPr>
+        <w:pStyle w:val="MDPI22heading2"/>
+      </w:pPr>
+      <w:r>
+        <w:rPr/>
+        <w:t>5.13. Fit Quality and Prediction of Failure</w:t>
+      </w:r>
+    </w:p>
+    <w:p>
+      <w:pPr>
+        <w:pStyle w:val="MDPI31text"/>
+      </w:pPr>
+      <w:r>
+        <w:rPr>
+          <w:b/>
+        </w:rPr>
+        <w:t>Fit quality.</w:t>
+      </w:r>
+      <w:r>
+        <w:rPr/>
+        <w:t xml:space="preserve"> A fitted temperature exists whether or not any temperature describes the choices, so the estimate has to be read with a measure of fit. Table 20 gives the mean log-likelihood per step of the chosen items under the same-history reference at the nominal temperature and at the fitted temperature, the gain from fitting, and the uniform value. Fitting adds almost nothing to what the reference already provides: 0.001 to 0.002 nats per step in clean cells, where it must add nothing, and 0.018 to 0.056 nats per step in distorted cells, against a mean negative log-likelihood of 0.96 to 1.15 nats at the nominal temperature. The fitted temperature lay on a grid bound in 6 of 266 distorted cells. The reference log-likelihood therefore carries what the fit carries, and the fit's only addition is the decomposition into scale and remainder (Section 5.9). Together with the intervals of Table 15, trajectory-level estimates should be reported with both an interval and this fit measure; both are given in Tables 15 and 20 and, for every cell, in the results files.</w:t>
+      </w:r>
+    </w:p>
+    <w:p>
+      <w:pPr>
+        <w:pStyle w:val="MDPI41tablecaption"/>
+      </w:pPr>
+      <w:r>
+        <w:rPr>
+          <w:b/>
+        </w:rPr>
+        <w:t xml:space="preserve">Table 20. </w:t>
+      </w:r>
+      <w:r>
+        <w:rPr/>
+        <w:t xml:space="preserve"> Fit of the same-history reference to the chosen items: mean log-likelihood per step at the nominal temperature and at the fitted temperature, gain from fitting (nats per step), and cells with the fitted temperature on a grid bound.</w:t>
+      </w:r>
+    </w:p>
+    <w:tbl>
+      <w:tblPr>
+        <w:tblW w:w="10466" w:type="dxa"/>
+        <w:tblInd w:w="0" w:type="dxa"/>
+        <w:tblLayout w:type="fixed"/>
+      </w:tblPr>
+      <w:tblGrid>
+        <w:gridCol w:w="2000"/>
+        <w:gridCol w:w="800"/>
+        <w:gridCol w:w="1500"/>
+        <w:gridCol w:w="1500"/>
+        <w:gridCol w:w="1200"/>
+        <w:gridCol w:w="1100"/>
+        <w:gridCol w:w="1000"/>
+        <w:gridCol w:w="1366"/>
+      </w:tblGrid>
+      <w:tr>
+        <w:trPr>
+          <w:cantSplit/>
+          <w:tblHeader/>
+        </w:trPr>
+        <w:tc>
+          <w:tcPr>
+            <w:tcW w:w="2000" w:type="dxa"/>
+            <w:tcBorders>
+              <w:top w:val="single" w:sz="8" w:space="0" w:color="000000"/>
+              <w:bottom w:val="single" w:sz="4" w:space="0" w:color="000000"/>
+            </w:tcBorders>
+            <w:vAlign w:val="center"/>
+          </w:tcPr>
+          <w:p>
+            <w:pPr>
+              <w:pStyle w:val="MDPI42tablebody"/>
+              <w:jc w:val="left"/>
+            </w:pPr>
+            <w:r>
+              <w:rPr>
+                <w:b/>
+                <w:sz w:val="16"/>
+              </w:rPr>
+              <w:t>Model</w:t>
+            </w:r>
+          </w:p>
+        </w:tc>
+        <w:tc>
+          <w:tcPr>
+            <w:tcW w:w="800" w:type="dxa"/>
+            <w:tcBorders>
+              <w:top w:val="single" w:sz="8" w:space="0" w:color="000000"/>
+              <w:bottom w:val="single" w:sz="4" w:space="0" w:color="000000"/>
+            </w:tcBorders>
+            <w:vAlign w:val="center"/>
+          </w:tcPr>
+          <w:p>
+            <w:pPr>
+              <w:pStyle w:val="MDPI42tablebody"/>
+              <w:jc w:val="center"/>
+            </w:pPr>
+            <w:r>
+              <w:rPr>
+                <w:b/>
+                <w:sz w:val="16"/>
+              </w:rPr>
+              <w:t>Cells</w:t>
+            </w:r>
+          </w:p>
+        </w:tc>
+        <w:tc>
+          <w:tcPr>
+            <w:tcW w:w="1500" w:type="dxa"/>
+            <w:tcBorders>
+              <w:top w:val="single" w:sz="8" w:space="0" w:color="000000"/>
+              <w:bottom w:val="single" w:sz="4" w:space="0" w:color="000000"/>
+            </w:tcBorders>
+            <w:vAlign w:val="center"/>
+          </w:tcPr>
+          <w:p>
+            <w:pPr>
+              <w:pStyle w:val="MDPI42tablebody"/>
+              <w:jc w:val="center"/>
+            </w:pPr>
+            <w:r>
+              <w:rPr>
+                <w:b/>
+                <w:sz w:val="16"/>
+              </w:rPr>
+              <w:t xml:space="preserve">Log-lik. at nominal </w:t>
+            </w:r>
+            <w:r>
+              <w:rPr>
+                <w:b/>
+                <w:i/>
+                <w:sz w:val="16"/>
+              </w:rPr>
+              <w:t>T</w:t>
+            </w:r>
+          </w:p>
+        </w:tc>
+        <w:tc>
+          <w:tcPr>
+            <w:tcW w:w="1500" w:type="dxa"/>
+            <w:tcBorders>
+              <w:top w:val="single" w:sz="8" w:space="0" w:color="000000"/>
+              <w:bottom w:val="single" w:sz="4" w:space="0" w:color="000000"/>
+            </w:tcBorders>
+            <w:vAlign w:val="center"/>
+          </w:tcPr>
+          <w:p>
+            <w:pPr>
+              <w:pStyle w:val="MDPI42tablebody"/>
+              <w:jc w:val="center"/>
+            </w:pPr>
+            <w:r>
+              <w:rPr>
+                <w:b/>
+                <w:sz w:val="16"/>
+              </w:rPr>
+              <w:t xml:space="preserve">Log-lik. at fitted </w:t>
+            </w:r>
+            <w:r>
+              <w:rPr>
+                <w:b/>
+                <w:i/>
+                <w:sz w:val="16"/>
+              </w:rPr>
+              <w:t>T</w:t>
+            </w:r>
+            <w:r>
+              <w:rPr>
+                <w:b/>
+                <w:sz w:val="16"/>
+              </w:rPr>
+              <w:t>eff</w:t>
+            </w:r>
+          </w:p>
+        </w:tc>
+        <w:tc>
+          <w:tcPr>
+            <w:tcW w:w="1200" w:type="dxa"/>
+            <w:tcBorders>
+              <w:top w:val="single" w:sz="8" w:space="0" w:color="000000"/>
+              <w:bottom w:val="single" w:sz="4" w:space="0" w:color="000000"/>
+            </w:tcBorders>
+            <w:vAlign w:val="center"/>
+          </w:tcPr>
+          <w:p>
+            <w:pPr>
+              <w:pStyle w:val="MDPI42tablebody"/>
+              <w:jc w:val="center"/>
+            </w:pPr>
+            <w:r>
+              <w:rPr>
+                <w:b/>
+                <w:sz w:val="16"/>
+              </w:rPr>
+              <w:t>Gain (distorted)</w:t>
+            </w:r>
+          </w:p>
+        </w:tc>
+        <w:tc>
+          <w:tcPr>
+            <w:tcW w:w="1100" w:type="dxa"/>
+            <w:tcBorders>
+              <w:top w:val="single" w:sz="8" w:space="0" w:color="000000"/>
+              <w:bottom w:val="single" w:sz="4" w:space="0" w:color="000000"/>
+            </w:tcBorders>
+            <w:vAlign w:val="center"/>
+          </w:tcPr>
+          <w:p>
+            <w:pPr>
+              <w:pStyle w:val="MDPI42tablebody"/>
+              <w:jc w:val="center"/>
+            </w:pPr>
+            <w:r>
+              <w:rPr>
+                <w:b/>
+                <w:sz w:val="16"/>
+              </w:rPr>
+              <w:t>Gain (clean)</w:t>
+            </w:r>
+          </w:p>
+        </w:tc>
+        <w:tc>
+          <w:tcPr>
+            <w:tcW w:w="1000" w:type="dxa"/>
+            <w:tcBorders>
+              <w:top w:val="single" w:sz="8" w:space="0" w:color="000000"/>
+              <w:bottom w:val="single" w:sz="4" w:space="0" w:color="000000"/>
+            </w:tcBorders>
+            <w:vAlign w:val="center"/>
+          </w:tcPr>
+          <w:p>
+            <w:pPr>
+              <w:pStyle w:val="MDPI42tablebody"/>
+              <w:jc w:val="center"/>
+            </w:pPr>
+            <w:r>
+              <w:rPr>
+                <w:b/>
+                <w:sz w:val="16"/>
+              </w:rPr>
+              <w:t>Uniform</w:t>
+            </w:r>
+          </w:p>
+        </w:tc>
+        <w:tc>
+          <w:tcPr>
+            <w:tcW w:w="1366" w:type="dxa"/>
+            <w:tcBorders>
+              <w:top w:val="single" w:sz="8" w:space="0" w:color="000000"/>
+              <w:bottom w:val="single" w:sz="4" w:space="0" w:color="000000"/>
+            </w:tcBorders>
+            <w:vAlign w:val="center"/>
+          </w:tcPr>
+          <w:p>
+            <w:pPr>
+              <w:pStyle w:val="MDPI42tablebody"/>
+              <w:jc w:val="center"/>
+            </w:pPr>
+            <w:r>
+              <w:rPr>
+                <w:b/>
+                <w:sz w:val="16"/>
+              </w:rPr>
+              <w:t>On grid bound</w:t>
+            </w:r>
+          </w:p>
+        </w:tc>
+      </w:tr>
+      <w:tr>
+        <w:trPr>
+          <w:cantSplit/>
+        </w:trPr>
+        <w:tc>
+          <w:tcPr>
+            <w:tcW w:w="2000" w:type="dxa"/>
+            <w:tcBorders/>
+            <w:vAlign w:val="center"/>
+          </w:tcPr>
+          <w:p>
+            <w:pPr>
+              <w:pStyle w:val="MDPI42tablebody"/>
+              <w:jc w:val="left"/>
+            </w:pPr>
+            <w:r>
+              <w:rPr>
+                <w:sz w:val="16"/>
+              </w:rPr>
+              <w:t>Qwen2.5-0.5B</w:t>
+            </w:r>
+          </w:p>
+        </w:tc>
+        <w:tc>
+          <w:tcPr>
+            <w:tcW w:w="800" w:type="dxa"/>
+            <w:tcBorders/>
+            <w:vAlign w:val="center"/>
+          </w:tcPr>
+          <w:p>
+            <w:pPr>
+              <w:pStyle w:val="MDPI42tablebody"/>
+              <w:jc w:val="center"/>
+            </w:pPr>
+            <w:r>
+              <w:rPr>
+                <w:sz w:val="16"/>
+              </w:rPr>
+              <w:t>88</w:t>
+            </w:r>
+          </w:p>
+        </w:tc>
+        <w:tc>
+          <w:tcPr>
+            <w:tcW w:w="1500" w:type="dxa"/>
+            <w:tcBorders/>
+            <w:vAlign w:val="center"/>
+          </w:tcPr>
+          <w:p>
+            <w:pPr>
+              <w:pStyle w:val="MDPI42tablebody"/>
+              <w:jc w:val="center"/>
+            </w:pPr>
+            <w:r>
+              <w:rPr>
+                <w:sz w:val="16"/>
+              </w:rPr>
+              <w:t>-1.15</w:t>
+            </w:r>
+          </w:p>
+        </w:tc>
+        <w:tc>
+          <w:tcPr>
+            <w:tcW w:w="1500" w:type="dxa"/>
+            <w:tcBorders/>
+            <w:vAlign w:val="center"/>
+          </w:tcPr>
+          <w:p>
+            <w:pPr>
+              <w:pStyle w:val="MDPI42tablebody"/>
+              <w:jc w:val="center"/>
+            </w:pPr>
+            <w:r>
+              <w:rPr>
+                <w:sz w:val="16"/>
+              </w:rPr>
+              <w:t>-1.14</w:t>
+            </w:r>
+          </w:p>
+        </w:tc>
+        <w:tc>
+          <w:tcPr>
+            <w:tcW w:w="1200" w:type="dxa"/>
+            <w:tcBorders/>
+            <w:vAlign w:val="center"/>
+          </w:tcPr>
+          <w:p>
+            <w:pPr>
+              <w:pStyle w:val="MDPI42tablebody"/>
+              <w:jc w:val="center"/>
+            </w:pPr>
+            <w:r>
+              <w:rPr>
+                <w:sz w:val="16"/>
+              </w:rPr>
+              <w:t>0.018</w:t>
+            </w:r>
+          </w:p>
+        </w:tc>
+        <w:tc>
+          <w:tcPr>
+            <w:tcW w:w="1100" w:type="dxa"/>
+            <w:tcBorders/>
+            <w:vAlign w:val="center"/>
+          </w:tcPr>
+          <w:p>
+            <w:pPr>
+              <w:pStyle w:val="MDPI42tablebody"/>
+              <w:jc w:val="center"/>
+            </w:pPr>
+            <w:r>
+              <w:rPr>
+                <w:sz w:val="16"/>
+              </w:rPr>
+              <w:t>0.001</w:t>
+            </w:r>
+          </w:p>
+        </w:tc>
+        <w:tc>
+          <w:tcPr>
+            <w:tcW w:w="1000" w:type="dxa"/>
+            <w:tcBorders/>
+            <w:vAlign w:val="center"/>
+          </w:tcPr>
+          <w:p>
+            <w:pPr>
+              <w:pStyle w:val="MDPI42tablebody"/>
+              <w:jc w:val="center"/>
+            </w:pPr>
+            <w:r>
+              <w:rPr>
+                <w:sz w:val="16"/>
+              </w:rPr>
+              <w:t>-2.58</w:t>
+            </w:r>
+          </w:p>
+        </w:tc>
+        <w:tc>
+          <w:tcPr>
+            <w:tcW w:w="1366" w:type="dxa"/>
+            <w:tcBorders/>
+            <w:vAlign w:val="center"/>
+          </w:tcPr>
+          <w:p>
+            <w:pPr>
+              <w:pStyle w:val="MDPI42tablebody"/>
+              <w:jc w:val="center"/>
+            </w:pPr>
+            <w:r>
+              <w:rPr>
+                <w:sz w:val="16"/>
+              </w:rPr>
+              <w:t>1/88</w:t>
+            </w:r>
+          </w:p>
+        </w:tc>
+      </w:tr>
+      <w:tr>
+        <w:trPr>
+          <w:cantSplit/>
+        </w:trPr>
+        <w:tc>
+          <w:tcPr>
+            <w:tcW w:w="2000" w:type="dxa"/>
+            <w:tcBorders/>
+            <w:vAlign w:val="center"/>
+          </w:tcPr>
+          <w:p>
+            <w:pPr>
+              <w:pStyle w:val="MDPI42tablebody"/>
+              <w:jc w:val="left"/>
+            </w:pPr>
+            <w:r>
+              <w:rPr>
+                <w:sz w:val="16"/>
+              </w:rPr>
+              <w:t>Qwen2.5-1.5B</w:t>
+            </w:r>
+          </w:p>
+        </w:tc>
+        <w:tc>
+          <w:tcPr>
+            <w:tcW w:w="800" w:type="dxa"/>
+            <w:tcBorders/>
+            <w:vAlign w:val="center"/>
+          </w:tcPr>
+          <w:p>
+            <w:pPr>
+              <w:pStyle w:val="MDPI42tablebody"/>
+              <w:jc w:val="center"/>
+            </w:pPr>
+            <w:r>
+              <w:rPr>
+                <w:sz w:val="16"/>
+              </w:rPr>
+              <w:t>66</w:t>
+            </w:r>
+          </w:p>
+        </w:tc>
+        <w:tc>
+          <w:tcPr>
+            <w:tcW w:w="1500" w:type="dxa"/>
+            <w:tcBorders/>
+            <w:vAlign w:val="center"/>
+          </w:tcPr>
+          <w:p>
+            <w:pPr>
+              <w:pStyle w:val="MDPI42tablebody"/>
+              <w:jc w:val="center"/>
+            </w:pPr>
+            <w:r>
+              <w:rPr>
+                <w:sz w:val="16"/>
+              </w:rPr>
+              <w:t>-0.96</w:t>
+            </w:r>
+          </w:p>
+        </w:tc>
+        <w:tc>
+          <w:tcPr>
+            <w:tcW w:w="1500" w:type="dxa"/>
+            <w:tcBorders/>
+            <w:vAlign w:val="center"/>
+          </w:tcPr>
+          <w:p>
+            <w:pPr>
+              <w:pStyle w:val="MDPI42tablebody"/>
+              <w:jc w:val="center"/>
+            </w:pPr>
+            <w:r>
+              <w:rPr>
+                <w:sz w:val="16"/>
+              </w:rPr>
+              <w:t>-0.91</w:t>
+            </w:r>
+          </w:p>
+        </w:tc>
+        <w:tc>
+          <w:tcPr>
+            <w:tcW w:w="1200" w:type="dxa"/>
+            <w:tcBorders/>
+            <w:vAlign w:val="center"/>
+          </w:tcPr>
+          <w:p>
+            <w:pPr>
+              <w:pStyle w:val="MDPI42tablebody"/>
+              <w:jc w:val="center"/>
+            </w:pPr>
+            <w:r>
+              <w:rPr>
+                <w:sz w:val="16"/>
+              </w:rPr>
+              <w:t>0.056</w:t>
+            </w:r>
+          </w:p>
+        </w:tc>
+        <w:tc>
+          <w:tcPr>
+            <w:tcW w:w="1100" w:type="dxa"/>
+            <w:tcBorders/>
+            <w:vAlign w:val="center"/>
+          </w:tcPr>
+          <w:p>
+            <w:pPr>
+              <w:pStyle w:val="MDPI42tablebody"/>
+              <w:jc w:val="center"/>
+            </w:pPr>
+            <w:r>
+              <w:rPr>
+                <w:sz w:val="16"/>
+              </w:rPr>
+              <w:t>0.002</w:t>
+            </w:r>
+          </w:p>
+        </w:tc>
+        <w:tc>
+          <w:tcPr>
+            <w:tcW w:w="1000" w:type="dxa"/>
+            <w:tcBorders/>
+            <w:vAlign w:val="center"/>
+          </w:tcPr>
+          <w:p>
+            <w:pPr>
+              <w:pStyle w:val="MDPI42tablebody"/>
+              <w:jc w:val="center"/>
+            </w:pPr>
+            <w:r>
+              <w:rPr>
+                <w:sz w:val="16"/>
+              </w:rPr>
+              <w:t>-2.61</w:t>
+            </w:r>
+          </w:p>
+        </w:tc>
+        <w:tc>
+          <w:tcPr>
+            <w:tcW w:w="1366" w:type="dxa"/>
+            <w:tcBorders/>
+            <w:vAlign w:val="center"/>
+          </w:tcPr>
+          <w:p>
+            <w:pPr>
+              <w:pStyle w:val="MDPI42tablebody"/>
+              <w:jc w:val="center"/>
+            </w:pPr>
+            <w:r>
+              <w:rPr>
+                <w:sz w:val="16"/>
+              </w:rPr>
+              <w:t>4/66</w:t>
+            </w:r>
+          </w:p>
+        </w:tc>
+      </w:tr>
+      <w:tr>
+        <w:trPr>
+          <w:cantSplit/>
+        </w:trPr>
+        <w:tc>
+          <w:tcPr>
+            <w:tcW w:w="2000" w:type="dxa"/>
+            <w:tcBorders/>
+            <w:vAlign w:val="center"/>
+          </w:tcPr>
+          <w:p>
+            <w:pPr>
+              <w:pStyle w:val="MDPI42tablebody"/>
+              <w:jc w:val="left"/>
+            </w:pPr>
+            <w:r>
+              <w:rPr>
+                <w:sz w:val="16"/>
+              </w:rPr>
+              <w:t>Llama-3.2-1B</w:t>
+            </w:r>
+          </w:p>
+        </w:tc>
+        <w:tc>
+          <w:tcPr>
+            <w:tcW w:w="800" w:type="dxa"/>
+            <w:tcBorders/>
+            <w:vAlign w:val="center"/>
+          </w:tcPr>
+          <w:p>
+            <w:pPr>
+              <w:pStyle w:val="MDPI42tablebody"/>
+              <w:jc w:val="center"/>
+            </w:pPr>
+            <w:r>
+              <w:rPr>
+                <w:sz w:val="16"/>
+              </w:rPr>
+              <w:t>88</w:t>
+            </w:r>
+          </w:p>
+        </w:tc>
+        <w:tc>
+          <w:tcPr>
+            <w:tcW w:w="1500" w:type="dxa"/>
+            <w:tcBorders/>
+            <w:vAlign w:val="center"/>
+          </w:tcPr>
+          <w:p>
+            <w:pPr>
+              <w:pStyle w:val="MDPI42tablebody"/>
+              <w:jc w:val="center"/>
+            </w:pPr>
+            <w:r>
+              <w:rPr>
+                <w:sz w:val="16"/>
+              </w:rPr>
+              <w:t>-1.09</w:t>
+            </w:r>
+          </w:p>
+        </w:tc>
+        <w:tc>
+          <w:tcPr>
+            <w:tcW w:w="1500" w:type="dxa"/>
+            <w:tcBorders/>
+            <w:vAlign w:val="center"/>
+          </w:tcPr>
+          <w:p>
+            <w:pPr>
+              <w:pStyle w:val="MDPI42tablebody"/>
+              <w:jc w:val="center"/>
+            </w:pPr>
+            <w:r>
+              <w:rPr>
+                <w:sz w:val="16"/>
+              </w:rPr>
+              <w:t>-1.05</w:t>
+            </w:r>
+          </w:p>
+        </w:tc>
+        <w:tc>
+          <w:tcPr>
+            <w:tcW w:w="1200" w:type="dxa"/>
+            <w:tcBorders/>
+            <w:vAlign w:val="center"/>
+          </w:tcPr>
+          <w:p>
+            <w:pPr>
+              <w:pStyle w:val="MDPI42tablebody"/>
+              <w:jc w:val="center"/>
+            </w:pPr>
+            <w:r>
+              <w:rPr>
+                <w:sz w:val="16"/>
+              </w:rPr>
+              <w:t>0.043</w:t>
+            </w:r>
+          </w:p>
+        </w:tc>
+        <w:tc>
+          <w:tcPr>
+            <w:tcW w:w="1100" w:type="dxa"/>
+            <w:tcBorders/>
+            <w:vAlign w:val="center"/>
+          </w:tcPr>
+          <w:p>
+            <w:pPr>
+              <w:pStyle w:val="MDPI42tablebody"/>
+              <w:jc w:val="center"/>
+            </w:pPr>
+            <w:r>
+              <w:rPr>
+                <w:sz w:val="16"/>
+              </w:rPr>
+              <w:t>0.002</w:t>
+            </w:r>
+          </w:p>
+        </w:tc>
+        <w:tc>
+          <w:tcPr>
+            <w:tcW w:w="1000" w:type="dxa"/>
+            <w:tcBorders/>
+            <w:vAlign w:val="center"/>
+          </w:tcPr>
+          <w:p>
+            <w:pPr>
+              <w:pStyle w:val="MDPI42tablebody"/>
+              <w:jc w:val="center"/>
+            </w:pPr>
+            <w:r>
+              <w:rPr>
+                <w:sz w:val="16"/>
+              </w:rPr>
+              <w:t>-2.58</w:t>
+            </w:r>
+          </w:p>
+        </w:tc>
+        <w:tc>
+          <w:tcPr>
+            <w:tcW w:w="1366" w:type="dxa"/>
+            <w:tcBorders/>
+            <w:vAlign w:val="center"/>
+          </w:tcPr>
+          <w:p>
+            <w:pPr>
+              <w:pStyle w:val="MDPI42tablebody"/>
+              <w:jc w:val="center"/>
+            </w:pPr>
+            <w:r>
+              <w:rPr>
+                <w:sz w:val="16"/>
+              </w:rPr>
+              <w:t>0/88</w:t>
+            </w:r>
+          </w:p>
+        </w:tc>
+      </w:tr>
+      <w:tr>
+        <w:trPr>
+          <w:cantSplit/>
+        </w:trPr>
+        <w:tc>
+          <w:tcPr>
+            <w:tcW w:w="2000" w:type="dxa"/>
+            <w:tcBorders>
+              <w:bottom w:val="single" w:sz="8" w:space="0" w:color="000000"/>
+            </w:tcBorders>
+            <w:vAlign w:val="center"/>
+          </w:tcPr>
+          <w:p>
+            <w:pPr>
+              <w:pStyle w:val="MDPI42tablebody"/>
+              <w:jc w:val="left"/>
+            </w:pPr>
+            <w:r>
+              <w:rPr>
+                <w:sz w:val="16"/>
+              </w:rPr>
+              <w:t>SmolLM2-1.7B</w:t>
+            </w:r>
+          </w:p>
+        </w:tc>
+        <w:tc>
+          <w:tcPr>
+            <w:tcW w:w="800" w:type="dxa"/>
+            <w:tcBorders>
+              <w:bottom w:val="single" w:sz="8" w:space="0" w:color="000000"/>
+            </w:tcBorders>
+            <w:vAlign w:val="center"/>
+          </w:tcPr>
+          <w:p>
+            <w:pPr>
+              <w:pStyle w:val="MDPI42tablebody"/>
+              <w:jc w:val="center"/>
+            </w:pPr>
+            <w:r>
+              <w:rPr>
+                <w:sz w:val="16"/>
+              </w:rPr>
+              <w:t>24</w:t>
+            </w:r>
+          </w:p>
+        </w:tc>
+        <w:tc>
+          <w:tcPr>
+            <w:tcW w:w="1500" w:type="dxa"/>
+            <w:tcBorders>
+              <w:bottom w:val="single" w:sz="8" w:space="0" w:color="000000"/>
+            </w:tcBorders>
+            <w:vAlign w:val="center"/>
+          </w:tcPr>
+          <w:p>
+            <w:pPr>
+              <w:pStyle w:val="MDPI42tablebody"/>
+              <w:jc w:val="center"/>
+            </w:pPr>
+            <w:r>
+              <w:rPr>
+                <w:sz w:val="16"/>
+              </w:rPr>
+              <w:t>-1.01</w:t>
+            </w:r>
+          </w:p>
+        </w:tc>
+        <w:tc>
+          <w:tcPr>
+            <w:tcW w:w="1500" w:type="dxa"/>
+            <w:tcBorders>
+              <w:bottom w:val="single" w:sz="8" w:space="0" w:color="000000"/>
+            </w:tcBorders>
+            <w:vAlign w:val="center"/>
+          </w:tcPr>
+          <w:p>
+            <w:pPr>
+              <w:pStyle w:val="MDPI42tablebody"/>
+              <w:jc w:val="center"/>
+            </w:pPr>
+            <w:r>
+              <w:rPr>
+                <w:sz w:val="16"/>
+              </w:rPr>
+              <w:t>-0.98</w:t>
+            </w:r>
+          </w:p>
+        </w:tc>
+        <w:tc>
+          <w:tcPr>
+            <w:tcW w:w="1200" w:type="dxa"/>
+            <w:tcBorders>
+              <w:bottom w:val="single" w:sz="8" w:space="0" w:color="000000"/>
+            </w:tcBorders>
+            <w:vAlign w:val="center"/>
+          </w:tcPr>
+          <w:p>
+            <w:pPr>
+              <w:pStyle w:val="MDPI42tablebody"/>
+              <w:jc w:val="center"/>
+            </w:pPr>
+            <w:r>
+              <w:rPr>
+                <w:sz w:val="16"/>
+              </w:rPr>
+              <w:t>0.022</w:t>
+            </w:r>
+          </w:p>
+        </w:tc>
+        <w:tc>
+          <w:tcPr>
+            <w:tcW w:w="1100" w:type="dxa"/>
+            <w:tcBorders>
+              <w:bottom w:val="single" w:sz="8" w:space="0" w:color="000000"/>
+            </w:tcBorders>
+            <w:vAlign w:val="center"/>
+          </w:tcPr>
+          <w:p>
+            <w:pPr>
+              <w:pStyle w:val="MDPI42tablebody"/>
+              <w:jc w:val="center"/>
+            </w:pPr>
+            <w:r>
+              <w:rPr>
+                <w:sz w:val="16"/>
+              </w:rPr>
+              <w:t>0.002</w:t>
+            </w:r>
+          </w:p>
+        </w:tc>
+        <w:tc>
+          <w:tcPr>
+            <w:tcW w:w="1000" w:type="dxa"/>
+            <w:tcBorders>
+              <w:bottom w:val="single" w:sz="8" w:space="0" w:color="000000"/>
+            </w:tcBorders>
+            <w:vAlign w:val="center"/>
+          </w:tcPr>
+          <w:p>
+            <w:pPr>
+              <w:pStyle w:val="MDPI42tablebody"/>
+              <w:jc w:val="center"/>
+            </w:pPr>
+            <w:r>
+              <w:rPr>
+                <w:sz w:val="16"/>
+              </w:rPr>
+              <w:t>-2.58</w:t>
+            </w:r>
+          </w:p>
+        </w:tc>
+        <w:tc>
+          <w:tcPr>
+            <w:tcW w:w="1366" w:type="dxa"/>
+            <w:tcBorders>
+              <w:bottom w:val="single" w:sz="8" w:space="0" w:color="000000"/>
+            </w:tcBorders>
+            <w:vAlign w:val="center"/>
+          </w:tcPr>
+          <w:p>
+            <w:pPr>
+              <w:pStyle w:val="MDPI42tablebody"/>
+              <w:jc w:val="center"/>
+            </w:pPr>
+            <w:r>
+              <w:rPr>
+                <w:sz w:val="16"/>
+              </w:rPr>
+              <w:t>1/24</w:t>
+            </w:r>
+          </w:p>
+        </w:tc>
+      </w:tr>
+    </w:tbl>
+    <w:p>
+      <w:pPr>
+        <w:pStyle w:val="MDPI43tablefooter"/>
+      </w:pPr>
+      <w:r>
+        <w:rPr/>
+        <w:t xml:space="preserve">Distorted cells are all prompt conditions except clean. The uniform value is -log </w:t>
+      </w:r>
+      <w:r>
+        <w:rPr>
+          <w:i/>
+        </w:rPr>
+        <w:t>K</w:t>
+      </w:r>
+      <w:r>
+        <w:rPr/>
+        <w:t xml:space="preserve"> for the number </w:t>
+      </w:r>
+      <w:r>
+        <w:rPr>
+          <w:i/>
+        </w:rPr>
+        <w:t>K</w:t>
+      </w:r>
+      <w:r>
+        <w:rPr/>
+        <w:t xml:space="preserve"> of candidates.</w:t>
+      </w:r>
+    </w:p>
+    <w:p>
+      <w:pPr>
+        <w:pStyle w:val="MDPI31text"/>
+      </w:pPr>
+      <w:r>
+        <w:rPr>
+          <w:b/>
+        </w:rPr>
+        <w:t>Does an indicator predict failure and not the prompt?</w:t>
+      </w:r>
+      <w:r>
+        <w:rPr/>
+        <w:t xml:space="preserve"> The comparison of Section 5.6 asks whether an indicator separates distorted from clean prompts. Detecting a distortion is not the same as detecting a problem, and the main text shows why: in Qwen2.5-3B pressure lowered ECE because it disrupted a confidently wrong repetition. We therefore evaluate the indicators against outcomes. Within each matched cell and separately for clean-prompt and distorted cells, we compute the probability that a trajectory that failed has a higher indicator value than one that did not (0.5 is chance), for the outcome low accuracy (fewer than half of the six steps correct). The other outcome, failure to recover the exact continuation, could not be analysed, because 99 to 100% of trajectories fail to recover and almost no cell contains both classes; low accuracy is also common (88 to 93% of trajectories in distorted cells), so only cells with at least three trajectories in each class enter Table 21. In these small models the distortions did not improve accuracy: the mean local accuracy was 0.19 to 0.29 in clean cells and 0.12 to 0.16 under P0, so the benefit of pressure seen in Qwen2.5-3B (ECE fell in five of eight cells) was not reproduced as a gain in accuracy, but the argument for outcome-based evaluation does not depend on it.</w:t>
+      </w:r>
+    </w:p>
+    <w:p>
+      <w:pPr>
+        <w:pStyle w:val="MDPI41tablecaption"/>
+      </w:pPr>
+      <w:r>
+        <w:rPr>
+          <w:b/>
+        </w:rPr>
+        <w:t xml:space="preserve">Table 21. </w:t>
+      </w:r>
+      <w:r>
+        <w:rPr/>
+        <w:t xml:space="preserve"> Prediction of low accuracy (fewer than half of six steps correct) within matched cells: mean signed AUC (probability that a failed trajectory has the higher value; 0.5 is chance) and number of cells with both outcomes, pooled over the four additional models.</w:t>
+      </w:r>
+    </w:p>
+    <w:tbl>
+      <w:tblPr>
+        <w:tblW w:w="10466" w:type="dxa"/>
+        <w:tblInd w:w="0" w:type="dxa"/>
+        <w:tblLayout w:type="fixed"/>
+      </w:tblPr>
+      <w:tblGrid>
+        <w:gridCol w:w="3800"/>
+        <w:gridCol w:w="2200"/>
+        <w:gridCol w:w="2200"/>
+        <w:gridCol w:w="2266"/>
+      </w:tblGrid>
+      <w:tr>
+        <w:trPr>
+          <w:cantSplit/>
+          <w:tblHeader/>
+        </w:trPr>
+        <w:tc>
+          <w:tcPr>
+            <w:tcW w:w="3800" w:type="dxa"/>
+            <w:tcBorders>
+              <w:top w:val="single" w:sz="8" w:space="0" w:color="000000"/>
+              <w:bottom w:val="single" w:sz="4" w:space="0" w:color="000000"/>
+            </w:tcBorders>
+            <w:vAlign w:val="center"/>
+          </w:tcPr>
+          <w:p>
+            <w:pPr>
+              <w:pStyle w:val="MDPI42tablebody"/>
+              <w:jc w:val="left"/>
+            </w:pPr>
+            <w:r>
+              <w:rPr>
+                <w:b/>
+                <w:sz w:val="16"/>
+              </w:rPr>
+              <w:t>Indicator (reference)</w:t>
+            </w:r>
+          </w:p>
+        </w:tc>
+        <w:tc>
+          <w:tcPr>
+            <w:tcW w:w="2200" w:type="dxa"/>
+            <w:tcBorders>
+              <w:top w:val="single" w:sz="8" w:space="0" w:color="000000"/>
+              <w:bottom w:val="single" w:sz="4" w:space="0" w:color="000000"/>
+            </w:tcBorders>
+            <w:vAlign w:val="center"/>
+          </w:tcPr>
+          <w:p>
+            <w:pPr>
+              <w:pStyle w:val="MDPI42tablebody"/>
+              <w:jc w:val="center"/>
+            </w:pPr>
+            <w:r>
+              <w:rPr>
+                <w:b/>
+                <w:sz w:val="16"/>
+              </w:rPr>
+              <w:t>Needs</w:t>
+            </w:r>
+          </w:p>
+        </w:tc>
+        <w:tc>
+          <w:tcPr>
+            <w:tcW w:w="2200" w:type="dxa"/>
+            <w:tcBorders>
+              <w:top w:val="single" w:sz="8" w:space="0" w:color="000000"/>
+              <w:bottom w:val="single" w:sz="4" w:space="0" w:color="000000"/>
+            </w:tcBorders>
+            <w:vAlign w:val="center"/>
+          </w:tcPr>
+          <w:p>
+            <w:pPr>
+              <w:pStyle w:val="MDPI42tablebody"/>
+              <w:jc w:val="center"/>
+            </w:pPr>
+            <w:r>
+              <w:rPr>
+                <w:b/>
+                <w:sz w:val="16"/>
+              </w:rPr>
+              <w:t>Clean-prompt cells: AUC (cells)</w:t>
+            </w:r>
+          </w:p>
+        </w:tc>
+        <w:tc>
+          <w:tcPr>
+            <w:tcW w:w="2266" w:type="dxa"/>
+            <w:tcBorders>
+              <w:top w:val="single" w:sz="8" w:space="0" w:color="000000"/>
+              <w:bottom w:val="single" w:sz="4" w:space="0" w:color="000000"/>
+            </w:tcBorders>
+            <w:vAlign w:val="center"/>
+          </w:tcPr>
+          <w:p>
+            <w:pPr>
+              <w:pStyle w:val="MDPI42tablebody"/>
+              <w:jc w:val="center"/>
+            </w:pPr>
+            <w:r>
+              <w:rPr>
+                <w:b/>
+                <w:sz w:val="16"/>
+              </w:rPr>
+              <w:t>Distorted cells: AUC (cells)</w:t>
+            </w:r>
+          </w:p>
+        </w:tc>
+      </w:tr>
+      <w:tr>
+        <w:trPr>
+          <w:cantSplit/>
+        </w:trPr>
+        <w:tc>
+          <w:tcPr>
+            <w:tcW w:w="3800" w:type="dxa"/>
+            <w:tcBorders/>
+            <w:vAlign w:val="center"/>
+          </w:tcPr>
+          <w:p>
+            <w:pPr>
+              <w:pStyle w:val="MDPI42tablebody"/>
+              <w:jc w:val="left"/>
+            </w:pPr>
+            <w:r>
+              <w:rPr>
+                <w:sz w:val="16"/>
+              </w:rPr>
+              <w:t>Token entropy</w:t>
+            </w:r>
+          </w:p>
+        </w:tc>
+        <w:tc>
+          <w:tcPr>
+            <w:tcW w:w="2200" w:type="dxa"/>
+            <w:tcBorders/>
+            <w:vAlign w:val="center"/>
+          </w:tcPr>
+          <w:p>
+            <w:pPr>
+              <w:pStyle w:val="MDPI42tablebody"/>
+              <w:jc w:val="center"/>
+            </w:pPr>
+            <w:r>
+              <w:rPr>
+                <w:sz w:val="16"/>
+              </w:rPr>
+              <w:t>–</w:t>
+            </w:r>
+          </w:p>
+        </w:tc>
+        <w:tc>
+          <w:tcPr>
+            <w:tcW w:w="2200" w:type="dxa"/>
+            <w:tcBorders/>
+            <w:vAlign w:val="center"/>
+          </w:tcPr>
+          <w:p>
+            <w:pPr>
+              <w:pStyle w:val="MDPI42tablebody"/>
+              <w:jc w:val="center"/>
+            </w:pPr>
+            <w:r>
+              <w:rPr>
+                <w:sz w:val="16"/>
+              </w:rPr>
+              <w:t>0.60 (22)</w:t>
+            </w:r>
+          </w:p>
+        </w:tc>
+        <w:tc>
+          <w:tcPr>
+            <w:tcW w:w="2266" w:type="dxa"/>
+            <w:tcBorders/>
+            <w:vAlign w:val="center"/>
+          </w:tcPr>
+          <w:p>
+            <w:pPr>
+              <w:pStyle w:val="MDPI42tablebody"/>
+              <w:jc w:val="center"/>
+            </w:pPr>
+            <w:r>
+              <w:rPr>
+                <w:sz w:val="16"/>
+              </w:rPr>
+              <w:t>0.61 (138)</w:t>
+            </w:r>
+          </w:p>
+        </w:tc>
+      </w:tr>
+      <w:tr>
+        <w:trPr>
+          <w:cantSplit/>
+        </w:trPr>
+        <w:tc>
+          <w:tcPr>
+            <w:tcW w:w="3800" w:type="dxa"/>
+            <w:tcBorders/>
+            <w:vAlign w:val="center"/>
+          </w:tcPr>
+          <w:p>
+            <w:pPr>
+              <w:pStyle w:val="MDPI42tablebody"/>
+              <w:jc w:val="left"/>
+            </w:pPr>
+            <w:r>
+              <w:rPr>
+                <w:sz w:val="16"/>
+              </w:rPr>
+              <w:t>Confidence</w:t>
+            </w:r>
+          </w:p>
+        </w:tc>
+        <w:tc>
+          <w:tcPr>
+            <w:tcW w:w="2200" w:type="dxa"/>
+            <w:tcBorders/>
+            <w:vAlign w:val="center"/>
+          </w:tcPr>
+          <w:p>
+            <w:pPr>
+              <w:pStyle w:val="MDPI42tablebody"/>
+              <w:jc w:val="center"/>
+            </w:pPr>
+            <w:r>
+              <w:rPr>
+                <w:sz w:val="16"/>
+              </w:rPr>
+              <w:t>–</w:t>
+            </w:r>
+          </w:p>
+        </w:tc>
+        <w:tc>
+          <w:tcPr>
+            <w:tcW w:w="2200" w:type="dxa"/>
+            <w:tcBorders/>
+            <w:vAlign w:val="center"/>
+          </w:tcPr>
+          <w:p>
+            <w:pPr>
+              <w:pStyle w:val="MDPI42tablebody"/>
+              <w:jc w:val="center"/>
+            </w:pPr>
+            <w:r>
+              <w:rPr>
+                <w:sz w:val="16"/>
+              </w:rPr>
+              <w:t>0.55 (22)</w:t>
+            </w:r>
+          </w:p>
+        </w:tc>
+        <w:tc>
+          <w:tcPr>
+            <w:tcW w:w="2266" w:type="dxa"/>
+            <w:tcBorders/>
+            <w:vAlign w:val="center"/>
+          </w:tcPr>
+          <w:p>
+            <w:pPr>
+              <w:pStyle w:val="MDPI42tablebody"/>
+              <w:jc w:val="center"/>
+            </w:pPr>
+            <w:r>
+              <w:rPr>
+                <w:sz w:val="16"/>
+              </w:rPr>
+              <w:t>0.52 (138)</w:t>
+            </w:r>
+          </w:p>
+        </w:tc>
+      </w:tr>
+      <w:tr>
+        <w:trPr>
+          <w:cantSplit/>
+        </w:trPr>
+        <w:tc>
+          <w:tcPr>
+            <w:tcW w:w="3800" w:type="dxa"/>
+            <w:tcBorders/>
+            <w:vAlign w:val="center"/>
+          </w:tcPr>
+          <w:p>
+            <w:pPr>
+              <w:pStyle w:val="MDPI42tablebody"/>
+              <w:jc w:val="left"/>
+            </w:pPr>
+            <w:r>
+              <w:rPr>
+                <w:sz w:val="16"/>
+              </w:rPr>
+              <w:t>Reference log-likelihood (same history)</w:t>
+            </w:r>
+          </w:p>
+        </w:tc>
+        <w:tc>
+          <w:tcPr>
+            <w:tcW w:w="2200" w:type="dxa"/>
+            <w:tcBorders/>
+            <w:vAlign w:val="center"/>
+          </w:tcPr>
+          <w:p>
+            <w:pPr>
+              <w:pStyle w:val="MDPI42tablebody"/>
+              <w:jc w:val="center"/>
+            </w:pPr>
+            <w:r>
+              <w:rPr>
+                <w:sz w:val="16"/>
+              </w:rPr>
+              <w:t>clean pass</w:t>
+            </w:r>
+          </w:p>
+        </w:tc>
+        <w:tc>
+          <w:tcPr>
+            <w:tcW w:w="2200" w:type="dxa"/>
+            <w:tcBorders/>
+            <w:vAlign w:val="center"/>
+          </w:tcPr>
+          <w:p>
+            <w:pPr>
+              <w:pStyle w:val="MDPI42tablebody"/>
+              <w:jc w:val="center"/>
+            </w:pPr>
+            <w:r>
+              <w:rPr>
+                <w:sz w:val="16"/>
+              </w:rPr>
+              <w:t>0.47 (22)</w:t>
+            </w:r>
+          </w:p>
+        </w:tc>
+        <w:tc>
+          <w:tcPr>
+            <w:tcW w:w="2266" w:type="dxa"/>
+            <w:tcBorders/>
+            <w:vAlign w:val="center"/>
+          </w:tcPr>
+          <w:p>
+            <w:pPr>
+              <w:pStyle w:val="MDPI42tablebody"/>
+              <w:jc w:val="center"/>
+            </w:pPr>
+            <w:r>
+              <w:rPr>
+                <w:sz w:val="16"/>
+              </w:rPr>
+              <w:t>0.57 (138)</w:t>
+            </w:r>
+          </w:p>
+        </w:tc>
+      </w:tr>
+      <w:tr>
+        <w:trPr>
+          <w:cantSplit/>
+        </w:trPr>
+        <w:tc>
+          <w:tcPr>
+            <w:tcW w:w="3800" w:type="dxa"/>
+            <w:tcBorders/>
+            <w:vAlign w:val="center"/>
+          </w:tcPr>
+          <w:p>
+            <w:pPr>
+              <w:pStyle w:val="MDPI42tablebody"/>
+              <w:jc w:val="left"/>
+            </w:pPr>
+            <w:r>
+              <w:rPr>
+                <w:sz w:val="16"/>
+              </w:rPr>
+              <w:t>KL(sampling ‖ reference)</w:t>
+            </w:r>
+          </w:p>
+        </w:tc>
+        <w:tc>
+          <w:tcPr>
+            <w:tcW w:w="2200" w:type="dxa"/>
+            <w:tcBorders/>
+            <w:vAlign w:val="center"/>
+          </w:tcPr>
+          <w:p>
+            <w:pPr>
+              <w:pStyle w:val="MDPI42tablebody"/>
+              <w:jc w:val="center"/>
+            </w:pPr>
+            <w:r>
+              <w:rPr>
+                <w:sz w:val="16"/>
+              </w:rPr>
+              <w:t>clean pass</w:t>
+            </w:r>
+          </w:p>
+        </w:tc>
+        <w:tc>
+          <w:tcPr>
+            <w:tcW w:w="2200" w:type="dxa"/>
+            <w:tcBorders/>
+            <w:vAlign w:val="center"/>
+          </w:tcPr>
+          <w:p>
+            <w:pPr>
+              <w:pStyle w:val="MDPI42tablebody"/>
+              <w:jc w:val="center"/>
+            </w:pPr>
+            <w:r>
+              <w:rPr>
+                <w:sz w:val="16"/>
+              </w:rPr>
+              <w:t>0.50 (22)</w:t>
+            </w:r>
+          </w:p>
+        </w:tc>
+        <w:tc>
+          <w:tcPr>
+            <w:tcW w:w="2266" w:type="dxa"/>
+            <w:tcBorders/>
+            <w:vAlign w:val="center"/>
+          </w:tcPr>
+          <w:p>
+            <w:pPr>
+              <w:pStyle w:val="MDPI42tablebody"/>
+              <w:jc w:val="center"/>
+            </w:pPr>
+            <w:r>
+              <w:rPr>
+                <w:sz w:val="16"/>
+              </w:rPr>
+              <w:t>0.57 (138)</w:t>
+            </w:r>
+          </w:p>
+        </w:tc>
+      </w:tr>
+      <w:tr>
+        <w:trPr>
+          <w:cantSplit/>
+        </w:trPr>
+        <w:tc>
+          <w:tcPr>
+            <w:tcW w:w="3800" w:type="dxa"/>
+            <w:tcBorders/>
+            <w:vAlign w:val="center"/>
+          </w:tcPr>
+          <w:p>
+            <w:pPr>
+              <w:pStyle w:val="MDPI42tablebody"/>
+              <w:jc w:val="left"/>
+            </w:pPr>
+            <w:r>
+              <w:rPr>
+                <w:i/>
+                <w:sz w:val="16"/>
+              </w:rPr>
+              <w:t>T</w:t>
+            </w:r>
+            <w:r>
+              <w:rPr>
+                <w:sz w:val="16"/>
+              </w:rPr>
+              <w:t>eff</w:t>
+            </w:r>
+            <w:r>
+              <w:rPr>
+                <w:sz w:val="16"/>
+              </w:rPr>
+              <w:t xml:space="preserve"> (same history)</w:t>
+            </w:r>
+          </w:p>
+        </w:tc>
+        <w:tc>
+          <w:tcPr>
+            <w:tcW w:w="2200" w:type="dxa"/>
+            <w:tcBorders/>
+            <w:vAlign w:val="center"/>
+          </w:tcPr>
+          <w:p>
+            <w:pPr>
+              <w:pStyle w:val="MDPI42tablebody"/>
+              <w:jc w:val="center"/>
+            </w:pPr>
+            <w:r>
+              <w:rPr>
+                <w:sz w:val="16"/>
+              </w:rPr>
+              <w:t>clean pass</w:t>
+            </w:r>
+          </w:p>
+        </w:tc>
+        <w:tc>
+          <w:tcPr>
+            <w:tcW w:w="2200" w:type="dxa"/>
+            <w:tcBorders/>
+            <w:vAlign w:val="center"/>
+          </w:tcPr>
+          <w:p>
+            <w:pPr>
+              <w:pStyle w:val="MDPI42tablebody"/>
+              <w:jc w:val="center"/>
+            </w:pPr>
+            <w:r>
+              <w:rPr>
+                <w:sz w:val="16"/>
+              </w:rPr>
+              <w:t>0.45 (22)</w:t>
+            </w:r>
+          </w:p>
+        </w:tc>
+        <w:tc>
+          <w:tcPr>
+            <w:tcW w:w="2266" w:type="dxa"/>
+            <w:tcBorders/>
+            <w:vAlign w:val="center"/>
+          </w:tcPr>
+          <w:p>
+            <w:pPr>
+              <w:pStyle w:val="MDPI42tablebody"/>
+              <w:jc w:val="center"/>
+            </w:pPr>
+            <w:r>
+              <w:rPr>
+                <w:sz w:val="16"/>
+              </w:rPr>
+              <w:t>0.53 (138)</w:t>
+            </w:r>
+          </w:p>
+        </w:tc>
+      </w:tr>
+      <w:tr>
+        <w:trPr>
+          <w:cantSplit/>
+        </w:trPr>
+        <w:tc>
+          <w:tcPr>
+            <w:tcW w:w="3800" w:type="dxa"/>
+            <w:tcBorders/>
+            <w:vAlign w:val="center"/>
+          </w:tcPr>
+          <w:p>
+            <w:pPr>
+              <w:pStyle w:val="MDPI42tablebody"/>
+              <w:jc w:val="left"/>
+            </w:pPr>
+            <w:r>
+              <w:rPr>
+                <w:i/>
+                <w:sz w:val="16"/>
+              </w:rPr>
+              <w:t>T</w:t>
+            </w:r>
+            <w:r>
+              <w:rPr>
+                <w:sz w:val="16"/>
+              </w:rPr>
+              <w:t>eff</w:t>
+            </w:r>
+            <w:r>
+              <w:rPr>
+                <w:sz w:val="16"/>
+                <w:vertAlign w:val="superscript"/>
+              </w:rPr>
+              <w:t>dist</w:t>
+            </w:r>
+            <w:r>
+              <w:rPr>
+                <w:sz w:val="16"/>
+              </w:rPr>
+              <w:t xml:space="preserve"> (same history)</w:t>
+            </w:r>
+          </w:p>
+        </w:tc>
+        <w:tc>
+          <w:tcPr>
+            <w:tcW w:w="2200" w:type="dxa"/>
+            <w:tcBorders/>
+            <w:vAlign w:val="center"/>
+          </w:tcPr>
+          <w:p>
+            <w:pPr>
+              <w:pStyle w:val="MDPI42tablebody"/>
+              <w:jc w:val="center"/>
+            </w:pPr>
+            <w:r>
+              <w:rPr>
+                <w:sz w:val="16"/>
+              </w:rPr>
+              <w:t>clean pass</w:t>
+            </w:r>
+          </w:p>
+        </w:tc>
+        <w:tc>
+          <w:tcPr>
+            <w:tcW w:w="2200" w:type="dxa"/>
+            <w:tcBorders/>
+            <w:vAlign w:val="center"/>
+          </w:tcPr>
+          <w:p>
+            <w:pPr>
+              <w:pStyle w:val="MDPI42tablebody"/>
+              <w:jc w:val="center"/>
+            </w:pPr>
+            <w:r>
+              <w:rPr>
+                <w:sz w:val="16"/>
+              </w:rPr>
+              <w:t>0.50 (22)</w:t>
+            </w:r>
+          </w:p>
+        </w:tc>
+        <w:tc>
+          <w:tcPr>
+            <w:tcW w:w="2266" w:type="dxa"/>
+            <w:tcBorders/>
+            <w:vAlign w:val="center"/>
+          </w:tcPr>
+          <w:p>
+            <w:pPr>
+              <w:pStyle w:val="MDPI42tablebody"/>
+              <w:jc w:val="center"/>
+            </w:pPr>
+            <w:r>
+              <w:rPr>
+                <w:sz w:val="16"/>
+              </w:rPr>
+              <w:t>0.45 (138)</w:t>
+            </w:r>
+          </w:p>
+        </w:tc>
+      </w:tr>
+      <w:tr>
+        <w:trPr>
+          <w:cantSplit/>
+        </w:trPr>
+        <w:tc>
+          <w:tcPr>
+            <w:tcW w:w="3800" w:type="dxa"/>
+            <w:tcBorders/>
+            <w:vAlign w:val="center"/>
+          </w:tcPr>
+          <w:p>
+            <w:pPr>
+              <w:pStyle w:val="MDPI42tablebody"/>
+              <w:jc w:val="left"/>
+            </w:pPr>
+            <w:r>
+              <w:rPr>
+                <w:sz w:val="16"/>
+              </w:rPr>
+              <w:t>Reference log-likelihood (de-duplicated history)</w:t>
+            </w:r>
+          </w:p>
+        </w:tc>
+        <w:tc>
+          <w:tcPr>
+            <w:tcW w:w="2200" w:type="dxa"/>
+            <w:tcBorders/>
+            <w:vAlign w:val="center"/>
+          </w:tcPr>
+          <w:p>
+            <w:pPr>
+              <w:pStyle w:val="MDPI42tablebody"/>
+              <w:jc w:val="center"/>
+            </w:pPr>
+            <w:r>
+              <w:rPr>
+                <w:sz w:val="16"/>
+              </w:rPr>
+              <w:t>clean pass, repetition detector</w:t>
+            </w:r>
+          </w:p>
+        </w:tc>
+        <w:tc>
+          <w:tcPr>
+            <w:tcW w:w="2200" w:type="dxa"/>
+            <w:tcBorders/>
+            <w:vAlign w:val="center"/>
+          </w:tcPr>
+          <w:p>
+            <w:pPr>
+              <w:pStyle w:val="MDPI42tablebody"/>
+              <w:jc w:val="center"/>
+            </w:pPr>
+            <w:r>
+              <w:rPr>
+                <w:sz w:val="16"/>
+              </w:rPr>
+              <w:t>0.96 (23)</w:t>
+            </w:r>
+          </w:p>
+        </w:tc>
+        <w:tc>
+          <w:tcPr>
+            <w:tcW w:w="2266" w:type="dxa"/>
+            <w:tcBorders/>
+            <w:vAlign w:val="center"/>
+          </w:tcPr>
+          <w:p>
+            <w:pPr>
+              <w:pStyle w:val="MDPI42tablebody"/>
+              <w:jc w:val="center"/>
+            </w:pPr>
+            <w:r>
+              <w:rPr>
+                <w:sz w:val="16"/>
+              </w:rPr>
+              <w:t>0.95 (45)</w:t>
+            </w:r>
+          </w:p>
+        </w:tc>
+      </w:tr>
+      <w:tr>
+        <w:trPr>
+          <w:cantSplit/>
+        </w:trPr>
+        <w:tc>
+          <w:tcPr>
+            <w:tcW w:w="3800" w:type="dxa"/>
+            <w:tcBorders/>
+            <w:vAlign w:val="center"/>
+          </w:tcPr>
+          <w:p>
+            <w:pPr>
+              <w:pStyle w:val="MDPI42tablebody"/>
+              <w:jc w:val="left"/>
+            </w:pPr>
+            <w:r>
+              <w:rPr>
+                <w:i/>
+                <w:sz w:val="16"/>
+              </w:rPr>
+              <w:t>T</w:t>
+            </w:r>
+            <w:r>
+              <w:rPr>
+                <w:sz w:val="16"/>
+              </w:rPr>
+              <w:t>eff</w:t>
+            </w:r>
+            <w:r>
+              <w:rPr>
+                <w:sz w:val="16"/>
+              </w:rPr>
+              <w:t xml:space="preserve"> (de-duplicated history)</w:t>
+            </w:r>
+          </w:p>
+        </w:tc>
+        <w:tc>
+          <w:tcPr>
+            <w:tcW w:w="2200" w:type="dxa"/>
+            <w:tcBorders/>
+            <w:vAlign w:val="center"/>
+          </w:tcPr>
+          <w:p>
+            <w:pPr>
+              <w:pStyle w:val="MDPI42tablebody"/>
+              <w:jc w:val="center"/>
+            </w:pPr>
+            <w:r>
+              <w:rPr>
+                <w:sz w:val="16"/>
+              </w:rPr>
+              <w:t>clean pass, repetition detector</w:t>
+            </w:r>
+          </w:p>
+        </w:tc>
+        <w:tc>
+          <w:tcPr>
+            <w:tcW w:w="2200" w:type="dxa"/>
+            <w:tcBorders/>
+            <w:vAlign w:val="center"/>
+          </w:tcPr>
+          <w:p>
+            <w:pPr>
+              <w:pStyle w:val="MDPI42tablebody"/>
+              <w:jc w:val="center"/>
+            </w:pPr>
+            <w:r>
+              <w:rPr>
+                <w:sz w:val="16"/>
+              </w:rPr>
+              <w:t>0.96 (23)</w:t>
+            </w:r>
+          </w:p>
+        </w:tc>
+        <w:tc>
+          <w:tcPr>
+            <w:tcW w:w="2266" w:type="dxa"/>
+            <w:tcBorders/>
+            <w:vAlign w:val="center"/>
+          </w:tcPr>
+          <w:p>
+            <w:pPr>
+              <w:pStyle w:val="MDPI42tablebody"/>
+              <w:jc w:val="center"/>
+            </w:pPr>
+            <w:r>
+              <w:rPr>
+                <w:sz w:val="16"/>
+              </w:rPr>
+              <w:t>0.95 (45)</w:t>
+            </w:r>
+          </w:p>
+        </w:tc>
+      </w:tr>
+      <w:tr>
+        <w:trPr>
+          <w:cantSplit/>
+        </w:trPr>
+        <w:tc>
+          <w:tcPr>
+            <w:tcW w:w="3800" w:type="dxa"/>
+            <w:tcBorders>
+              <w:bottom w:val="single" w:sz="8" w:space="0" w:color="000000"/>
+            </w:tcBorders>
+            <w:vAlign w:val="center"/>
+          </w:tcPr>
+          <w:p>
+            <w:pPr>
+              <w:pStyle w:val="MDPI42tablebody"/>
+              <w:jc w:val="left"/>
+            </w:pPr>
+            <w:r>
+              <w:rPr>
+                <w:sz w:val="16"/>
+              </w:rPr>
+              <w:t>Reference log-likelihood (gold-repaired history)</w:t>
+            </w:r>
+          </w:p>
+        </w:tc>
+        <w:tc>
+          <w:tcPr>
+            <w:tcW w:w="2200" w:type="dxa"/>
+            <w:tcBorders>
+              <w:bottom w:val="single" w:sz="8" w:space="0" w:color="000000"/>
+            </w:tcBorders>
+            <w:vAlign w:val="center"/>
+          </w:tcPr>
+          <w:p>
+            <w:pPr>
+              <w:pStyle w:val="MDPI42tablebody"/>
+              <w:jc w:val="center"/>
+            </w:pPr>
+            <w:r>
+              <w:rPr>
+                <w:sz w:val="16"/>
+              </w:rPr>
+              <w:t>clean pass, task order</w:t>
+            </w:r>
+          </w:p>
+        </w:tc>
+        <w:tc>
+          <w:tcPr>
+            <w:tcW w:w="2200" w:type="dxa"/>
+            <w:tcBorders>
+              <w:bottom w:val="single" w:sz="8" w:space="0" w:color="000000"/>
+            </w:tcBorders>
+            <w:vAlign w:val="center"/>
+          </w:tcPr>
+          <w:p>
+            <w:pPr>
+              <w:pStyle w:val="MDPI42tablebody"/>
+              <w:jc w:val="center"/>
+            </w:pPr>
+            <w:r>
+              <w:rPr>
+                <w:sz w:val="16"/>
+              </w:rPr>
+              <w:t>0.99 (22)</w:t>
+            </w:r>
+          </w:p>
+        </w:tc>
+        <w:tc>
+          <w:tcPr>
+            <w:tcW w:w="2266" w:type="dxa"/>
+            <w:tcBorders>
+              <w:bottom w:val="single" w:sz="8" w:space="0" w:color="000000"/>
+            </w:tcBorders>
+            <w:vAlign w:val="center"/>
+          </w:tcPr>
+          <w:p>
+            <w:pPr>
+              <w:pStyle w:val="MDPI42tablebody"/>
+              <w:jc w:val="center"/>
+            </w:pPr>
+            <w:r>
+              <w:rPr>
+                <w:sz w:val="16"/>
+              </w:rPr>
+              <w:t>0.98 (138)</w:t>
+            </w:r>
+          </w:p>
+        </w:tc>
+      </w:tr>
+    </w:tbl>
+    <w:p>
+      <w:pPr>
+        <w:pStyle w:val="MDPI43tablefooter"/>
+      </w:pPr>
+      <w:r>
+        <w:rPr/>
+        <w:t>Matched cells (</w:t>
+      </w:r>
+      <w:r>
+        <w:rPr>
+          <w:i/>
+        </w:rPr>
+        <w:t>T</w:t>
+      </w:r>
+      <w:r>
+        <w:rPr/>
+        <w:t xml:space="preserve"> = 0.8, 2.0) for all rows except the de-duplicated reference, which uses the reference-comparison cells (sticky attractor, </w:t>
+      </w:r>
+      <w:r>
+        <w:rPr>
+          <w:i/>
+        </w:rPr>
+        <w:t>T</w:t>
+      </w:r>
+      <w:r>
+        <w:rPr/>
+        <w:t xml:space="preserve"> = 0.15, 0.8, 2.0).</w:t>
+      </w:r>
+    </w:p>
+    <w:p>
+      <w:pPr>
+        <w:pStyle w:val="MDPI31text"/>
+      </w:pPr>
+      <w:r>
+        <w:rPr/>
+        <w:t xml:space="preserve">Within a cell, the indicators computed from the sampling distribution or from the same-history reference were close to chance, at most weakly informative, as predictors of failure (distorted cells: entropy 0.61, reference log-likelihood 0.57, </w:t>
+      </w:r>
+      <w:r>
+        <w:rPr>
+          <w:i/>
+        </w:rPr>
+        <w:t>T</w:t>
+      </w:r>
+      <w:r>
+        <w:rPr/>
+        <w:t>eff</w:t>
+      </w:r>
+      <w:r>
+        <w:rPr/>
+        <w:t xml:space="preserve"> 0.53). The indicators that did predict failure were those computed against a repaired reference (AUC 0.95 for the de-duplicated reference in distorted cells). This is expected, and it limits what the result shows. A repaired reference asks the model, in a healthy context, what the next item should be, so its log-likelihood works as a verifier that uses the model's own knowledge of the list. The gold-repaired version uses the task order, and the de-duplicated version needs only a repetition detector but still presumes that the clean model knows the answer. The fitted temperature under these references predicted failure about as well as the log-likelihood itself, because a poor fit moves it to a grid bound, so its value again adds nothing beyond the log-likelihood. We conclude that a label-free indicator based on the sampling distribution predicts failure at most weakly in this task family, and that a reference-based log-likelihood does so only when the reference is repaired and the model knows the task.</w:t>
+      </w:r>
+    </w:p>
+    <w:p>
+      <w:pPr>
         <w:pStyle w:val="MDPI21heading1"/>
         <w:keepNext/>
       </w:pPr>
@@ -20463,7 +22448,7 @@
       </w:r>
       <w:r>
         <w:rPr/>
-        <w:t>. First, it is not a measure of decoder randomness. It is the temperature-equivalent of the context's net effect on the logit scale, and when the context mainly reorders the candidates a rescaling explains only a part of the effect (on average 26% of the divergence in pressured cells). Second, as a detector it was dominated by quantities it is computed from, namely the reference log-likelihood and the divergence, and by token entropy, in four additional models, in three wordings of each distortion and in full-vocabulary generation. Third, with six choices per trajectory the 95% interval of the trajectory-level estimate spans a median factor of 9, so single-trajectory values are not usable and the indicator needs pooling over many steps. Fourth, it costs one extra forward pass per step (the reference pass took 0.95 times as long as the sampling pass in our free-generation runs). Whether a model-specific diagnostic that reports a share of a context effect as scale is worth that cost depends on the use. We would not recommend it as a monitor.</w:t>
+        <w:t>. First, it is not a measure of decoder randomness. It is the temperature-equivalent of the context's net effect on the logit scale, and when the context mainly reorders the candidates a rescaling explains only a part of the effect (on average 26% of the divergence in pressured cells). Second, as a detector it was dominated by quantities it is computed from, namely the reference log-likelihood and the divergence, and by token entropy, in four additional models, in three wordings of each distortion and in full-vocabulary generation. Third, with six choices per trajectory the 95% interval of the trajectory-level estimate spans a median factor of 9, so single-trajectory values are not usable and the indicator needs pooling over many steps. Fourth, it costs one extra forward pass per step (the reference pass took 0.95 times as long as the sampling pass in our free-generation runs). Whether a model-specific diagnostic that reports a share of a context effect as scale is worth that cost depends on the use. We would not recommend it as a monitor. Fifth, detecting a distorted prompt is not the same as detecting a failure: against failure itself (Section 5.13), indicators based on the sampling distribution or on the same-history reference were close to chance, and only references with a repaired history predicted failure, as a verifier of the model's own knowledge.</w:t>
       </w:r>
     </w:p>
     <w:p>
@@ -20691,6 +22676,15 @@
       <w:r>
         <w:rPr/>
         <w:t>The reference is a modelling choice. The same-history reference is blind when the history itself locks the agent, and the repaired references answer a different question (Section 5.10). No reference is neutral, and we tested no reference from a different model.</w:t>
+      </w:r>
+    </w:p>
+    <w:p>
+      <w:pPr>
+        <w:pStyle w:val="MDPI38bullet"/>
+      </w:pPr>
+      <w:r>
+        <w:rPr/>
+        <w:t>Prediction of failure (Section 5.13) could be evaluated only for low accuracy and only in cells where both outcomes occur, because most trajectories fail in the sticky and strong regimes; failure to recover could not be analysed.</w:t>
       </w:r>
     </w:p>
     <w:p>
@@ -26660,6 +28654,58 @@
       <w:r>
         <w:rPr/>
         <w:t>, 359–378.</w:t>
+      </w:r>
+    </w:p>
+    <w:p>
+      <w:pPr>
+        <w:pStyle w:val="MDPI81references"/>
+        <w:numPr>
+          <w:ilvl w:val="0"/>
+          <w:numId w:val="8"/>
+        </w:numPr>
+        <w:ind w:left="425" w:hanging="425"/>
+      </w:pPr>
+      <w:r>
+        <w:rPr/>
+        <w:t>Renze, M.; Guven, E. The Effect of Sampling Temperature on Problem Solving in Large Language Models. In Findings of the Association for Computational Linguistics: EMNLP 2024, Miami, FL, USA, 12–16 November 2024; pp. 7346–7356.</w:t>
+      </w:r>
+    </w:p>
+    <w:p>
+      <w:pPr>
+        <w:pStyle w:val="MDPI81references"/>
+        <w:numPr>
+          <w:ilvl w:val="0"/>
+          <w:numId w:val="8"/>
+        </w:numPr>
+        <w:ind w:left="425" w:hanging="425"/>
+      </w:pPr>
+      <w:r>
+        <w:rPr/>
+        <w:t xml:space="preserve">Xu, J.; Liu, X.; Yan, J.; Cai, D.; Li, H.; Li, J. Learning to Break the Loop: Analyzing and Mitigating Repetitions for Neural Text Generation. In </w:t>
+      </w:r>
+      <w:r>
+        <w:rPr>
+          <w:i/>
+        </w:rPr>
+        <w:t>Advances in Neural Information Processing Systems 35 (NeurIPS 2022)</w:t>
+      </w:r>
+      <w:r>
+        <w:rPr/>
+        <w:t>; Curran Associates: Red Hook, NY, USA, 2022.</w:t>
+      </w:r>
+    </w:p>
+    <w:p>
+      <w:pPr>
+        <w:pStyle w:val="MDPI81references"/>
+        <w:numPr>
+          <w:ilvl w:val="0"/>
+          <w:numId w:val="8"/>
+        </w:numPr>
+        <w:ind w:left="425" w:hanging="425"/>
+      </w:pPr>
+      <w:r>
+        <w:rPr/>
+        <w:t>Xie, J.; Chen, A.S.; Lee, Y.; Mitchell, E.; Finn, C. Calibrating Language Models with Adaptive Temperature Scaling. In Proceedings of the 2024 Conference on Empirical Methods in Natural Language Processing (EMNLP), Miami, FL, USA, 12–16 November 2024.</w:t>
       </w:r>
     </w:p>
     <w:p>

</xml_diff>